<commit_message>
Huck: revisão geral, pacote e thumbnails
Co-Authored-By: Claude Opus 5.5 <noreply@anthropic.com>
Claude-Session: https://claude.ai/code/session_01MJjUEEZrxQDEUifKK2vj9g
</commit_message>
<xml_diff>
--- a/roteiros/luciano-huck/Huck_Roteiro_Completo.docx
+++ b/roteiros/luciano-huck/Huck_Roteiro_Completo.docx
@@ -991,7 +991,7 @@
         <w:rPr>
           <w:color w:val="000000"/>
         </w:rPr>
-        <w:t>É importante dizer uma coisa com todas as letras. Contratos de publicidade são legais. Apresentadores famosos fazem propaganda de bancos o tempo todo. E Huck afirma que esse acordo teve contrato assinado, notas emitidas e impostos pagos.</w:t>
+        <w:t>Uma coisa precisa ficar clara, com todas as letras. Contratos de publicidade são legais. Apresentadores famosos fazem propaganda de bancos o tempo todo. E Huck afirma que esse acordo teve contrato assinado, notas emitidas e impostos pagos.</w:t>
       </w:r>
     </w:p>
     <w:p>
@@ -1575,7 +1575,7 @@
         <w:rPr>
           <w:color w:val="000000"/>
         </w:rPr>
-        <w:t>É importante repetir. Não há nenhuma indicação de que Huck soubesse da prisão. A mensagem comemora uma notícia que tinha acabado de passar no Jornal Nacional. E Huck não é investigado no caso.</w:t>
+        <w:t>Precisa ficar claro de novo. Não há nenhuma indicação de que Huck soubesse da prisão. A mensagem comemora uma notícia que tinha acabado de passar no Jornal Nacional. E Huck não é investigado no caso.</w:t>
       </w:r>
     </w:p>
     <w:p>

</xml_diff>